<commit_message>
updated Instructions in English
</commit_message>
<xml_diff>
--- a/en_Instructions.docx
+++ b/en_Instructions.docx
@@ -35,33 +35,20 @@
           <w:szCs w:val="20"/>
           <w:u w:val="none"/>
           <w:shd w:val="clear" w:color="auto" w:fill="FFFFFF"/>
+          <w:lang w:val="en-GB"/>
         </w:rPr>
       </w:pPr>
       <w:r>
         <w:rPr>
           <w:b/>
-        </w:rPr>
-        <w:t>Download the</w:t>
-      </w:r>
-      <w:r>
-        <w:rPr>
-          <w:b/>
-        </w:rPr>
-        <w:t xml:space="preserve"> Java-.jar-</w:t>
-      </w:r>
-      <w:r>
-        <w:rPr>
-          <w:b/>
-        </w:rPr>
-        <w:t>File under</w:t>
-      </w:r>
-      <w:r>
-        <w:rPr>
-          <w:b/>
-        </w:rPr>
-        <w:t>:</w:t>
-      </w:r>
-      <w:r>
+          <w:lang w:val="en-GB"/>
+        </w:rPr>
+        <w:t>Download the Java-.jar-File under:</w:t>
+      </w:r>
+      <w:r>
+        <w:rPr>
+          <w:lang w:val="en-GB"/>
+        </w:rPr>
         <w:t xml:space="preserve"> </w:t>
       </w:r>
       <w:hyperlink r:id="rId8" w:history="1">
@@ -73,6 +60,7 @@
             <w:sz w:val="20"/>
             <w:szCs w:val="20"/>
             <w:shd w:val="clear" w:color="auto" w:fill="FFFFFF"/>
+            <w:lang w:val="en-GB"/>
           </w:rPr>
           <w:t>http://www.mediafire.com/download/pkmtcw1gb5cgqs6/bfmeResFix_v1.4.0+Final.jar</w:t>
         </w:r>
@@ -88,11 +76,15 @@
           <w:sz w:val="20"/>
           <w:szCs w:val="20"/>
           <w:shd w:val="clear" w:color="auto" w:fill="FFFFFF"/>
-        </w:rPr>
-      </w:pPr>
-    </w:p>
-    <w:p>
-      <w:r>
+          <w:lang w:val="en-GB"/>
+        </w:rPr>
+      </w:pPr>
+    </w:p>
+    <w:p>
+      <w:r>
+        <w:rPr>
+          <w:lang w:val="en-GB"/>
+        </w:rPr>
         <w:tab/>
       </w:r>
       <w:r>
@@ -149,11 +141,13 @@
         <w:ind w:left="708"/>
         <w:rPr>
           <w:i/>
-        </w:rPr>
-      </w:pPr>
-      <w:r>
-        <w:rPr>
-          <w:i/>
+          <w:lang w:val="en-GB"/>
+        </w:rPr>
+      </w:pPr>
+      <w:r>
+        <w:rPr>
+          <w:i/>
+          <w:lang w:val="en-GB"/>
         </w:rPr>
         <w:t>Browsers like Google Chrome demand for a security check.</w:t>
       </w:r>
@@ -164,17 +158,20 @@
         <w:ind w:left="708"/>
         <w:rPr>
           <w:i/>
-        </w:rPr>
-      </w:pPr>
-      <w:r>
-        <w:rPr>
-          <w:i/>
+          <w:lang w:val="en-GB"/>
+        </w:rPr>
+      </w:pPr>
+      <w:r>
+        <w:rPr>
+          <w:i/>
+          <w:lang w:val="en-GB"/>
         </w:rPr>
         <w:t>Dont worry, the program is virus-free</w:t>
       </w:r>
       <w:r>
         <w:rPr>
           <w:i/>
+          <w:lang w:val="en-GB"/>
         </w:rPr>
         <w:t xml:space="preserve">: </w:t>
       </w:r>
@@ -183,6 +180,7 @@
           <w:rPr>
             <w:rStyle w:val="Hyperlink"/>
             <w:i/>
+            <w:lang w:val="en-GB"/>
           </w:rPr>
           <w:t>https://www.virustotal.com/de/url/f01fafcf82a15e6494b9172f6f97f4065766879cb6c8c12da93c7c5f7f33eb7d/analysis/</w:t>
         </w:r>
@@ -194,6 +192,7 @@
         <w:ind w:left="708"/>
         <w:rPr>
           <w:i/>
+          <w:lang w:val="en-GB"/>
         </w:rPr>
       </w:pPr>
     </w:p>
@@ -206,31 +205,15 @@
         </w:numPr>
         <w:rPr>
           <w:b/>
+          <w:lang w:val="en-GB"/>
         </w:rPr>
       </w:pPr>
       <w:r>
         <w:rPr>
           <w:b/>
-        </w:rPr>
-        <w:t xml:space="preserve">Start </w:t>
-      </w:r>
-      <w:r>
-        <w:rPr>
-          <w:b/>
-        </w:rPr>
-        <w:t>the downloaded</w:t>
-      </w:r>
-      <w:r>
-        <w:rPr>
-          <w:b/>
-        </w:rPr>
-        <w:t xml:space="preserve"> Java-.jar-</w:t>
-      </w:r>
-      <w:r>
-        <w:rPr>
-          <w:b/>
-        </w:rPr>
-        <w:t>File with Java Platform SE binary.</w:t>
+          <w:lang w:val="en-GB"/>
+        </w:rPr>
+        <w:t>Start the downloaded Java-.jar-File with Java Platform SE binary.</w:t>
       </w:r>
     </w:p>
     <w:p>
@@ -239,11 +222,13 @@
         <w:ind w:left="708"/>
         <w:rPr>
           <w:i/>
-        </w:rPr>
-      </w:pPr>
-      <w:r>
-        <w:rPr>
-          <w:i/>
+          <w:lang w:val="en-GB"/>
+        </w:rPr>
+      </w:pPr>
+      <w:r>
+        <w:rPr>
+          <w:i/>
+          <w:lang w:val="en-GB"/>
         </w:rPr>
         <w:t xml:space="preserve">If it is </w:t>
       </w:r>
@@ -251,30 +236,35 @@
         <w:rPr>
           <w:i/>
           <w:u w:val="single"/>
+          <w:lang w:val="en-GB"/>
         </w:rPr>
         <w:t>not</w:t>
       </w:r>
       <w:r>
         <w:rPr>
           <w:i/>
+          <w:lang w:val="en-GB"/>
         </w:rPr>
         <w:t xml:space="preserve"> in your list</w:t>
       </w:r>
       <w:r>
         <w:rPr>
           <w:i/>
+          <w:lang w:val="en-GB"/>
         </w:rPr>
         <w:t xml:space="preserve">, </w:t>
       </w:r>
       <w:r>
         <w:rPr>
           <w:i/>
+          <w:lang w:val="en-GB"/>
         </w:rPr>
         <w:t>you need to install the latest Java-version</w:t>
       </w:r>
       <w:r>
         <w:rPr>
           <w:i/>
+          <w:lang w:val="en-GB"/>
         </w:rPr>
         <w:t xml:space="preserve">: </w:t>
       </w:r>
@@ -283,6 +273,7 @@
           <w:rPr>
             <w:rStyle w:val="Hyperlink"/>
             <w:i/>
+            <w:lang w:val="en-GB"/>
           </w:rPr>
           <w:t>https://www.java.com/en/download/</w:t>
         </w:r>
@@ -298,10 +289,10 @@
           <w:lang w:eastAsia="de-DE"/>
         </w:rPr>
         <w:drawing>
-          <wp:inline distT="0" distB="0" distL="0" distR="0" wp14:anchorId="017724BD" wp14:editId="5A56E9B7">
-            <wp:extent cx="5029200" cy="2387620"/>
-            <wp:effectExtent l="0" t="0" r="0" b="0"/>
-            <wp:docPr id="6" name="Grafik 6"/>
+          <wp:inline distT="0" distB="0" distL="0" distR="0" wp14:anchorId="53180D56" wp14:editId="15609BAD">
+            <wp:extent cx="4581856" cy="2260120"/>
+            <wp:effectExtent l="0" t="0" r="9525" b="6985"/>
+            <wp:docPr id="3" name="Grafik 3"/>
             <wp:cNvGraphicFramePr>
               <a:graphicFrameLocks xmlns:a="http://schemas.openxmlformats.org/drawingml/2006/main" noChangeAspect="1"/>
             </wp:cNvGraphicFramePr>
@@ -309,10 +300,10 @@
               <a:graphicData uri="http://schemas.openxmlformats.org/drawingml/2006/picture">
                 <pic:pic xmlns:pic="http://schemas.openxmlformats.org/drawingml/2006/picture">
                   <pic:nvPicPr>
-                    <pic:cNvPr id="6" name="open with java.PNG"/>
+                    <pic:cNvPr id="3" name="en1.PNG"/>
                     <pic:cNvPicPr/>
                   </pic:nvPicPr>
-                  <pic:blipFill rotWithShape="1">
+                  <pic:blipFill>
                     <a:blip r:embed="rId12">
                       <a:extLst>
                         <a:ext uri="{28A0092B-C50C-407E-A947-70E740481C1C}">
@@ -320,25 +311,18 @@
                         </a:ext>
                       </a:extLst>
                     </a:blip>
-                    <a:srcRect b="29991"/>
-                    <a:stretch/>
+                    <a:stretch>
+                      <a:fillRect/>
+                    </a:stretch>
                   </pic:blipFill>
-                  <pic:spPr bwMode="auto">
+                  <pic:spPr>
                     <a:xfrm>
                       <a:off x="0" y="0"/>
-                      <a:ext cx="5063028" cy="2403680"/>
+                      <a:ext cx="4604771" cy="2271423"/>
                     </a:xfrm>
                     <a:prstGeom prst="rect">
                       <a:avLst/>
                     </a:prstGeom>
-                    <a:ln>
-                      <a:noFill/>
-                    </a:ln>
-                    <a:extLst>
-                      <a:ext uri="{53640926-AAD7-44D8-BBD7-CCE9431645EC}">
-                        <a14:shadowObscured xmlns:a14="http://schemas.microsoft.com/office/drawing/2010/main"/>
-                      </a:ext>
-                    </a:extLst>
                   </pic:spPr>
                 </pic:pic>
               </a:graphicData>
@@ -362,17 +346,20 @@
         <w:spacing w:line="360" w:lineRule="auto"/>
         <w:rPr>
           <w:b/>
+          <w:lang w:val="en-GB"/>
         </w:rPr>
       </w:pPr>
       <w:r>
         <w:rPr>
           <w:b/>
+          <w:lang w:val="en-GB"/>
         </w:rPr>
         <w:t>Choose you game by clicking through the tabs</w:t>
       </w:r>
       <w:r>
         <w:rPr>
           <w:b/>
+          <w:lang w:val="en-GB"/>
         </w:rPr>
         <w:t>.</w:t>
       </w:r>
@@ -443,11 +430,13 @@
         </w:numPr>
         <w:rPr>
           <w:b/>
+          <w:lang w:val="en-GB"/>
         </w:rPr>
       </w:pPr>
       <w:r>
         <w:rPr>
           <w:b/>
+          <w:lang w:val="en-GB"/>
         </w:rPr>
         <w:t xml:space="preserve">Choose the Language in which you’ve </w:t>
       </w:r>
@@ -455,34 +444,16 @@
         <w:rPr>
           <w:b/>
           <w:u w:val="single"/>
-        </w:rPr>
-        <w:t xml:space="preserve">installed the </w:t>
+          <w:lang w:val="en-GB"/>
+        </w:rPr>
+        <w:t>installed the game</w:t>
       </w:r>
       <w:r>
         <w:rPr>
           <w:b/>
-          <w:u w:val="single"/>
-        </w:rPr>
-        <w:t>g</w:t>
-      </w:r>
-      <w:r>
-        <w:rPr>
-          <w:b/>
-          <w:u w:val="single"/>
-        </w:rPr>
-        <w:t>ame</w:t>
-      </w:r>
-      <w:r>
-        <w:rPr>
-          <w:b/>
-        </w:rPr>
-        <w:t xml:space="preserve"> </w:t>
-      </w:r>
-      <w:r>
-        <w:rPr>
-          <w:b/>
-        </w:rPr>
-        <w:t>and select your preferred resolution.</w:t>
+          <w:lang w:val="en-GB"/>
+        </w:rPr>
+        <w:t xml:space="preserve"> and select your preferred resolution.</w:t>
       </w:r>
     </w:p>
     <w:p>
@@ -520,11 +491,13 @@
         </w:numPr>
         <w:rPr>
           <w:i/>
-        </w:rPr>
-      </w:pPr>
-      <w:r>
-        <w:rPr>
-          <w:i/>
+          <w:lang w:val="en-GB"/>
+        </w:rPr>
+      </w:pPr>
+      <w:r>
+        <w:rPr>
+          <w:i/>
+          <w:lang w:val="en-GB"/>
         </w:rPr>
         <w:t>Your current monitor-resolution is auto-selected.</w:t>
       </w:r>
@@ -538,11 +511,13 @@
         </w:numPr>
         <w:rPr>
           <w:b/>
-        </w:rPr>
-      </w:pPr>
-      <w:r>
-        <w:rPr>
-          <w:i/>
+          <w:lang w:val="en-GB"/>
+        </w:rPr>
+      </w:pPr>
+      <w:r>
+        <w:rPr>
+          <w:i/>
+          <w:lang w:val="en-GB"/>
         </w:rPr>
         <w:t xml:space="preserve">Your preferred resolution should </w:t>
       </w:r>
@@ -550,25 +525,22 @@
         <w:rPr>
           <w:i/>
           <w:u w:val="single"/>
+          <w:lang w:val="en-GB"/>
         </w:rPr>
         <w:t>not</w:t>
       </w:r>
       <w:r>
         <w:rPr>
           <w:i/>
-        </w:rPr>
-        <w:t xml:space="preserve"> be larger than your monitors resolution, because the game has no </w:t>
-      </w:r>
-      <w:r>
-        <w:rPr>
-          <w:i/>
-        </w:rPr>
-        <w:t>support for Decimation</w:t>
+          <w:lang w:val="en-GB"/>
+        </w:rPr>
+        <w:t xml:space="preserve"> be larger than your monitors resolution, because the game has no support for Decimation</w:t>
       </w:r>
       <w:r>
         <w:rPr>
           <w:rStyle w:val="Funotenzeichen"/>
           <w:i/>
+          <w:lang w:val="en-GB"/>
         </w:rPr>
         <w:t xml:space="preserve"> </w:t>
       </w:r>
@@ -582,14 +554,9 @@
       <w:r>
         <w:rPr>
           <w:i/>
-        </w:rPr>
-        <w:t xml:space="preserve"> like</w:t>
-      </w:r>
-      <w:r>
-        <w:rPr>
-          <w:i/>
-        </w:rPr>
-        <w:t xml:space="preserve"> Nvidia DSR</w:t>
+          <w:lang w:val="en-GB"/>
+        </w:rPr>
+        <w:t xml:space="preserve"> like Nvidia DSR</w:t>
       </w:r>
       <w:r>
         <w:rPr>
@@ -601,6 +568,7 @@
       <w:r>
         <w:rPr>
           <w:i/>
+          <w:lang w:val="en-GB"/>
         </w:rPr>
         <w:t>.</w:t>
       </w:r>
@@ -629,19 +597,15 @@
         <w:pStyle w:val="Listenabsatz"/>
         <w:rPr>
           <w:i/>
-        </w:rPr>
-      </w:pPr>
-      <w:r>
-        <w:rPr>
-          <w:i/>
-        </w:rPr>
-        <w:t>A pop-up will appear (see Figure</w:t>
-      </w:r>
-      <w:r>
-        <w:rPr>
-          <w:i/>
-        </w:rPr>
-        <w:t xml:space="preserve">). </w:t>
+          <w:lang w:val="en-GB"/>
+        </w:rPr>
+      </w:pPr>
+      <w:r>
+        <w:rPr>
+          <w:i/>
+          <w:lang w:val="en-GB"/>
+        </w:rPr>
+        <w:t xml:space="preserve">A pop-up will appear (see Figure). </w:t>
       </w:r>
     </w:p>
     <w:p>
@@ -653,38 +617,30 @@
         </w:numPr>
         <w:rPr>
           <w:i/>
-        </w:rPr>
-      </w:pPr>
-      <w:r>
-        <w:rPr>
-          <w:i/>
-        </w:rPr>
-        <w:t>„Done! (Created</w:t>
-      </w:r>
-      <w:r>
-        <w:rPr>
-          <w:i/>
-        </w:rPr>
-        <w:t xml:space="preserve"> + Path)“ – The file did </w:t>
+          <w:lang w:val="en-GB"/>
+        </w:rPr>
+      </w:pPr>
+      <w:r>
+        <w:rPr>
+          <w:i/>
+          <w:lang w:val="en-GB"/>
+        </w:rPr>
+        <w:t xml:space="preserve">„Done! (Created + Path)“ – The file did </w:t>
       </w:r>
       <w:r>
         <w:rPr>
           <w:i/>
           <w:u w:val="single"/>
+          <w:lang w:val="en-GB"/>
         </w:rPr>
         <w:t>not</w:t>
       </w:r>
       <w:r>
         <w:rPr>
           <w:i/>
-        </w:rPr>
-        <w:t xml:space="preserve"> existed before and has been generated </w:t>
-      </w:r>
-      <w:r>
-        <w:rPr>
-          <w:i/>
-        </w:rPr>
-        <w:t>.</w:t>
+          <w:lang w:val="en-GB"/>
+        </w:rPr>
+        <w:t xml:space="preserve"> existed before and has been generated .</w:t>
       </w:r>
     </w:p>
     <w:p>
@@ -696,11 +652,13 @@
         </w:numPr>
         <w:rPr>
           <w:i/>
-        </w:rPr>
-      </w:pPr>
-      <w:r>
-        <w:rPr>
-          <w:i/>
+          <w:lang w:val="en-GB"/>
+        </w:rPr>
+      </w:pPr>
+      <w:r>
+        <w:rPr>
+          <w:i/>
+          <w:lang w:val="en-GB"/>
         </w:rPr>
         <w:t>„Done! (Edited + Path)“ – The file existed before and has been edited.</w:t>
       </w:r>
@@ -714,23 +672,27 @@
         </w:numPr>
         <w:rPr>
           <w:i/>
-        </w:rPr>
-      </w:pPr>
-      <w:r>
-        <w:rPr>
-          <w:i/>
+          <w:lang w:val="en-GB"/>
+        </w:rPr>
+      </w:pPr>
+      <w:r>
+        <w:rPr>
+          <w:i/>
+          <w:lang w:val="en-GB"/>
         </w:rPr>
         <w:t xml:space="preserve">Repeat Step 4 and 5 for every </w:t>
       </w:r>
       <w:r>
         <w:rPr>
           <w:i/>
+          <w:lang w:val="en-GB"/>
         </w:rPr>
         <w:t>„Battle for Middle-Earth“-Game</w:t>
       </w:r>
       <w:r>
         <w:rPr>
           <w:i/>
+          <w:lang w:val="en-GB"/>
         </w:rPr>
         <w:t>.</w:t>
       </w:r>
@@ -741,6 +703,7 @@
         <w:ind w:left="1080"/>
         <w:rPr>
           <w:i/>
+          <w:lang w:val="en-GB"/>
         </w:rPr>
       </w:pPr>
     </w:p>
@@ -851,43 +814,89 @@
         <w:pStyle w:val="Listenabsatz"/>
         <w:rPr>
           <w:i/>
-        </w:rPr>
-      </w:pPr>
-      <w:r>
-        <w:rPr>
-          <w:i/>
-        </w:rPr>
-        <w:t>If you have a computer with two graphics processing units you need to start the game with your dedicated GPU, to avoid game-crashes. (In this example:  use the „NVIDIA High-performance-processor“).</w:t>
-      </w:r>
-    </w:p>
-    <w:p>
-      <w:pPr>
-        <w:pStyle w:val="Listenabsatz"/>
+          <w:lang w:val="en-GB"/>
+        </w:rPr>
+      </w:pPr>
+      <w:r>
+        <w:rPr>
+          <w:i/>
+          <w:lang w:val="en-GB"/>
+        </w:rPr>
+        <w:t xml:space="preserve">If you have a computer with two graphics processing units you need to start the game with your dedicated GPU, </w:t>
+      </w:r>
+      <w:r>
+        <w:rPr>
+          <w:i/>
+          <w:lang w:val="en-GB"/>
+        </w:rPr>
+        <w:t xml:space="preserve">in order </w:t>
+      </w:r>
+      <w:r>
+        <w:rPr>
+          <w:i/>
+          <w:lang w:val="en-GB"/>
+        </w:rPr>
+        <w:t>to avoid g</w:t>
+      </w:r>
+      <w:r>
+        <w:rPr>
+          <w:i/>
+          <w:lang w:val="en-GB"/>
+        </w:rPr>
+        <w:t xml:space="preserve">ame-crashes. (In this example: </w:t>
+      </w:r>
+      <w:r>
+        <w:rPr>
+          <w:i/>
+          <w:lang w:val="en-GB"/>
+        </w:rPr>
+        <w:t>use the „</w:t>
+      </w:r>
+      <w:r>
+        <w:rPr>
+          <w:i/>
+          <w:lang w:val="en-GB"/>
+        </w:rPr>
+        <w:t>High-performance NVIDIA processor</w:t>
+      </w:r>
+      <w:r>
+        <w:rPr>
+          <w:i/>
+          <w:lang w:val="en-GB"/>
+        </w:rPr>
+        <w:t>“).</w:t>
+      </w:r>
+    </w:p>
+    <w:p>
+      <w:pPr>
+        <w:pStyle w:val="Listenabsatz"/>
+        <w:rPr>
+          <w:i/>
+          <w:noProof/>
+          <w:lang w:val="en-GB" w:eastAsia="de-DE"/>
+        </w:rPr>
+      </w:pPr>
+      <w:bookmarkStart w:id="0" w:name="_GoBack"/>
+      <w:bookmarkEnd w:id="0"/>
+    </w:p>
+    <w:p>
+      <w:pPr>
+        <w:pStyle w:val="Listenabsatz"/>
+        <w:rPr>
+          <w:i/>
+        </w:rPr>
+      </w:pPr>
+      <w:r>
         <w:rPr>
           <w:i/>
           <w:noProof/>
           <w:lang w:eastAsia="de-DE"/>
         </w:rPr>
-      </w:pPr>
-    </w:p>
-    <w:p>
-      <w:pPr>
-        <w:pStyle w:val="Listenabsatz"/>
-        <w:rPr>
-          <w:i/>
-        </w:rPr>
-      </w:pPr>
-      <w:r>
-        <w:rPr>
-          <w:i/>
-          <w:noProof/>
-          <w:lang w:eastAsia="de-DE"/>
-        </w:rPr>
         <w:drawing>
-          <wp:inline distT="0" distB="0" distL="0" distR="0" wp14:anchorId="017724C1" wp14:editId="4D82AF35">
-            <wp:extent cx="5700395" cy="1473269"/>
+          <wp:inline distT="0" distB="0" distL="0" distR="0" wp14:anchorId="5495765E" wp14:editId="41166CD3">
+            <wp:extent cx="5760720" cy="1485900"/>
             <wp:effectExtent l="0" t="0" r="0" b="0"/>
-            <wp:docPr id="5" name="Grafik 5"/>
+            <wp:docPr id="8" name="Grafik 8"/>
             <wp:cNvGraphicFramePr>
               <a:graphicFrameLocks xmlns:a="http://schemas.openxmlformats.org/drawingml/2006/main" noChangeAspect="1"/>
             </wp:cNvGraphicFramePr>
@@ -895,10 +904,10 @@
               <a:graphicData uri="http://schemas.openxmlformats.org/drawingml/2006/picture">
                 <pic:pic xmlns:pic="http://schemas.openxmlformats.org/drawingml/2006/picture">
                   <pic:nvPicPr>
-                    <pic:cNvPr id="5" name="4.PNG"/>
+                    <pic:cNvPr id="8" name="en3.PNG"/>
                     <pic:cNvPicPr/>
                   </pic:nvPicPr>
-                  <pic:blipFill rotWithShape="1">
+                  <pic:blipFill>
                     <a:blip r:embed="rId15">
                       <a:extLst>
                         <a:ext uri="{28A0092B-C50C-407E-A947-70E740481C1C}">
@@ -906,25 +915,18 @@
                         </a:ext>
                       </a:extLst>
                     </a:blip>
-                    <a:srcRect b="60916"/>
-                    <a:stretch/>
+                    <a:stretch>
+                      <a:fillRect/>
+                    </a:stretch>
                   </pic:blipFill>
-                  <pic:spPr bwMode="auto">
+                  <pic:spPr>
                     <a:xfrm>
                       <a:off x="0" y="0"/>
-                      <a:ext cx="5901863" cy="1525338"/>
+                      <a:ext cx="5760720" cy="1485900"/>
                     </a:xfrm>
                     <a:prstGeom prst="rect">
                       <a:avLst/>
                     </a:prstGeom>
-                    <a:ln>
-                      <a:noFill/>
-                    </a:ln>
-                    <a:extLst>
-                      <a:ext uri="{53640926-AAD7-44D8-BBD7-CCE9431645EC}">
-                        <a14:shadowObscured xmlns:a14="http://schemas.microsoft.com/office/drawing/2010/main"/>
-                      </a:ext>
-                    </a:extLst>
                   </pic:spPr>
                 </pic:pic>
               </a:graphicData>
@@ -946,11 +948,13 @@
         <w:pStyle w:val="Listenabsatz"/>
         <w:rPr>
           <w:i/>
-        </w:rPr>
-      </w:pPr>
-      <w:r>
-        <w:rPr>
-          <w:i/>
+          <w:lang w:val="en-GB"/>
+        </w:rPr>
+      </w:pPr>
+      <w:r>
+        <w:rPr>
+          <w:i/>
+          <w:lang w:val="en-GB"/>
         </w:rPr>
         <w:t>Hint:</w:t>
       </w:r>
@@ -960,21 +964,15 @@
         <w:pStyle w:val="Listenabsatz"/>
         <w:rPr>
           <w:i/>
-        </w:rPr>
-      </w:pPr>
-      <w:r>
-        <w:rPr>
-          <w:i/>
-        </w:rPr>
-        <w:t>If you want to m</w:t>
-      </w:r>
-      <w:bookmarkStart w:id="0" w:name="_GoBack"/>
-      <w:bookmarkEnd w:id="0"/>
-      <w:r>
-        <w:rPr>
-          <w:i/>
-        </w:rPr>
-        <w:t>anually patch the game, just go to my Mediafire-Folder:</w:t>
+          <w:lang w:val="en-GB"/>
+        </w:rPr>
+      </w:pPr>
+      <w:r>
+        <w:rPr>
+          <w:i/>
+          <w:lang w:val="en-GB"/>
+        </w:rPr>
+        <w:t>If you want to manually patch the game, just go to my Mediafire-Folder:</w:t>
       </w:r>
     </w:p>
     <w:p>
@@ -983,6 +981,7 @@
         <w:rPr>
           <w:rStyle w:val="Hyperlink"/>
           <w:i/>
+          <w:lang w:val="en-GB"/>
         </w:rPr>
       </w:pPr>
       <w:hyperlink r:id="rId16" w:history="1">
@@ -990,6 +989,7 @@
           <w:rPr>
             <w:rStyle w:val="Hyperlink"/>
             <w:i/>
+            <w:lang w:val="en-GB"/>
           </w:rPr>
           <w:t>https://www.mediafire.com/folder/s50wrxf0a7w0s/Patches_for_The_Battle_for_Middle-Earth-Trilogy</w:t>
         </w:r>
@@ -1000,6 +1000,7 @@
         <w:pStyle w:val="Listenabsatz"/>
         <w:rPr>
           <w:i/>
+          <w:lang w:val="en-GB"/>
         </w:rPr>
       </w:pPr>
     </w:p>
@@ -1009,11 +1010,13 @@
         <w:rPr>
           <w:rStyle w:val="Hyperlink"/>
           <w:i/>
-        </w:rPr>
-      </w:pPr>
-      <w:r>
-        <w:rPr>
-          <w:i/>
+          <w:lang w:val="en-GB"/>
+        </w:rPr>
+      </w:pPr>
+      <w:r>
+        <w:rPr>
+          <w:i/>
+          <w:lang w:val="en-GB"/>
         </w:rPr>
         <w:t xml:space="preserve">You need additional help? Send me an Email: </w:t>
       </w:r>
@@ -1022,6 +1025,7 @@
           <w:rPr>
             <w:rStyle w:val="Hyperlink"/>
             <w:i/>
+            <w:lang w:val="en-GB"/>
           </w:rPr>
           <w:t>MorgulLord29isback@gmail.com</w:t>
         </w:r>
@@ -1032,6 +1036,7 @@
         <w:ind w:firstLine="708"/>
         <w:rPr>
           <w:i/>
+          <w:lang w:val="en-GB"/>
         </w:rPr>
       </w:pPr>
     </w:p>
@@ -1040,6 +1045,7 @@
         <w:ind w:firstLine="708"/>
         <w:rPr>
           <w:i/>
+          <w:lang w:val="en-GB"/>
         </w:rPr>
       </w:pPr>
     </w:p>
@@ -2266,7 +2272,7 @@
 </file>
 
 <file path=customXml/itemProps1.xml><?xml version="1.0" encoding="utf-8"?>
-<ds:datastoreItem xmlns:ds="http://schemas.openxmlformats.org/officeDocument/2006/customXml" ds:itemID="{3EAE1EF4-C9C5-4E73-9F00-AE86633865C9}">
+<ds:datastoreItem xmlns:ds="http://schemas.openxmlformats.org/officeDocument/2006/customXml" ds:itemID="{AA2F6390-FB55-4BAD-A703-A38693D9D98D}">
   <ds:schemaRefs>
     <ds:schemaRef ds:uri="http://schemas.openxmlformats.org/officeDocument/2006/bibliography"/>
   </ds:schemaRefs>

</xml_diff>

<commit_message>
updated Instruction in English
</commit_message>
<xml_diff>
--- a/en_Instructions.docx
+++ b/en_Instructions.docx
@@ -166,7 +166,21 @@
           <w:i/>
           <w:lang w:val="en-GB"/>
         </w:rPr>
-        <w:t>Dont worry, the program is virus-free</w:t>
+        <w:t>Don</w:t>
+      </w:r>
+      <w:r>
+        <w:rPr>
+          <w:i/>
+          <w:lang w:val="en-GB"/>
+        </w:rPr>
+        <w:t>’</w:t>
+      </w:r>
+      <w:r>
+        <w:rPr>
+          <w:i/>
+          <w:lang w:val="en-GB"/>
+        </w:rPr>
+        <w:t>t worry, the program is virus-free</w:t>
       </w:r>
       <w:r>
         <w:rPr>
@@ -213,7 +227,14 @@
           <w:b/>
           <w:lang w:val="en-GB"/>
         </w:rPr>
-        <w:t>Start the downloaded Java-.jar-File with Java Platform SE binary.</w:t>
+        <w:t>Open</w:t>
+      </w:r>
+      <w:r>
+        <w:rPr>
+          <w:b/>
+          <w:lang w:val="en-GB"/>
+        </w:rPr>
+        <w:t xml:space="preserve"> the downloaded Java-.jar-File with Java Platform SE binary.</w:t>
       </w:r>
     </w:p>
     <w:p>
@@ -354,7 +375,21 @@
           <w:b/>
           <w:lang w:val="en-GB"/>
         </w:rPr>
-        <w:t>Choose you game by clicking through the tabs</w:t>
+        <w:t>Choose you</w:t>
+      </w:r>
+      <w:r>
+        <w:rPr>
+          <w:b/>
+          <w:lang w:val="en-GB"/>
+        </w:rPr>
+        <w:t>r</w:t>
+      </w:r>
+      <w:r>
+        <w:rPr>
+          <w:b/>
+          <w:lang w:val="en-GB"/>
+        </w:rPr>
+        <w:t xml:space="preserve"> game by clicking through the tabs</w:t>
       </w:r>
       <w:r>
         <w:rPr>
@@ -556,7 +591,21 @@
           <w:i/>
           <w:lang w:val="en-GB"/>
         </w:rPr>
-        <w:t xml:space="preserve"> like Nvidia DSR</w:t>
+        <w:t xml:space="preserve"> like N</w:t>
+      </w:r>
+      <w:r>
+        <w:rPr>
+          <w:i/>
+          <w:lang w:val="en-GB"/>
+        </w:rPr>
+        <w:t xml:space="preserve">VIDIA </w:t>
+      </w:r>
+      <w:r>
+        <w:rPr>
+          <w:i/>
+          <w:lang w:val="en-GB"/>
+        </w:rPr>
+        <w:t>DSR</w:t>
       </w:r>
       <w:r>
         <w:rPr>
@@ -786,7 +835,15 @@
         <w:rPr>
           <w:b/>
         </w:rPr>
-        <w:t>Start the game</w:t>
+        <w:t>Start the gam</w:t>
+      </w:r>
+      <w:bookmarkStart w:id="0" w:name="_GoBack"/>
+      <w:bookmarkEnd w:id="0"/>
+      <w:r>
+        <w:rPr>
+          <w:b/>
+        </w:rPr>
+        <w:t>e</w:t>
       </w:r>
     </w:p>
     <w:p>
@@ -876,8 +933,6 @@
           <w:lang w:val="en-GB" w:eastAsia="de-DE"/>
         </w:rPr>
       </w:pPr>
-      <w:bookmarkStart w:id="0" w:name="_GoBack"/>
-      <w:bookmarkEnd w:id="0"/>
     </w:p>
     <w:p>
       <w:pPr>
@@ -1130,7 +1185,7 @@
           <w:rPr>
             <w:noProof/>
           </w:rPr>
-          <w:t>2</w:t>
+          <w:t>1</w:t>
         </w:r>
         <w:r>
           <w:fldChar w:fldCharType="end"/>
@@ -2272,7 +2327,7 @@
 </file>
 
 <file path=customXml/itemProps1.xml><?xml version="1.0" encoding="utf-8"?>
-<ds:datastoreItem xmlns:ds="http://schemas.openxmlformats.org/officeDocument/2006/customXml" ds:itemID="{AA2F6390-FB55-4BAD-A703-A38693D9D98D}">
+<ds:datastoreItem xmlns:ds="http://schemas.openxmlformats.org/officeDocument/2006/customXml" ds:itemID="{1AB6A4AD-24E1-4CB7-A5BF-86849CE2E777}">
   <ds:schemaRefs>
     <ds:schemaRef ds:uri="http://schemas.openxmlformats.org/officeDocument/2006/bibliography"/>
   </ds:schemaRefs>

</xml_diff>